<commit_message>
Rewrite reflection paper with fully original phrasing
Co-authored-by: fatimai146 <fatimai146@users.noreply.github.com>
</commit_message>
<xml_diff>
--- a/Reflection_Paper_Tech_Landscape.docx
+++ b/Reflection_Paper_Tech_Landscape.docx
@@ -7,7 +7,7 @@
         <w:ind w:firstLine="720"/>
       </w:pPr>
       <w:r>
-        <w:t>The first session of the Technology Landscape series was not what I expected. With Dan DeLaurentis called away, two senior leaders from the Office of Research stepped in: Maryanne, the operations manager, and Dr. Sivasankar, the Vice President for Research Innovation. What could have been a quick substitute overview turned into a genuinely compelling look at how Purdue's $2.8 billion research enterprise works, why it matters, and where business students fit into it. By the end of the hour I was thinking about my time here differently.</w:t>
+        <w:t>I walked into the first Technology Landscape session expecting a standard orientation talk. Dan DeLaurentis was supposed to speak but got pulled into university business, so two senior leaders from the Office of Research filled in: Maryanne, who manages operations for the office, and Dr. Sivasankar, a faculty member in speech and hearing sciences who also serves as Vice President for Research Innovation. What followed was far more engaging than I anticipated. Rather than reading off slides, they walked us through how Purdue's research engine actually works, where the money comes from, and why students in the business school should care about any of it.</w:t>
       </w:r>
     </w:p>
     <w:p>
@@ -15,7 +15,7 @@
         <w:ind w:firstLine="720"/>
       </w:pPr>
       <w:r>
-        <w:t>The part of the lecture that reshaped how I think about education was Dr. Sivasankar's own story. He trained as a behavioral speech pathologist, then went into physiology for his PhD, and now leads work that looks nothing like either field. His point was simple but powerful: the goal of education is not to lock you into a lane, it is to give you the tools to move between lanes as problems evolve. That idea came through even more clearly when he talked about Purdue's institutes and centers at Discovery Park District, which cover everything from neuroscience to quantum science to nanotechnology and are built to overlap. The strongest research programs sit in those overlaps, combining disciplines rather than staying inside one. For a business student, that reframes what getting involved in research can actually look like. You do not need a lab coat to be useful to a research team. What labs often lack is commercial judgment, market sense, and the kind of thinking that turns a working prototype into something that reaches real people. Dr. Sivasankar's career was a good reminder that you can move far from your original training if you stay willing to apply what you know to a different problem.</w:t>
+        <w:t>On the education side, Dr. Sivasankar's personal journey made the strongest impression. He started out studying speech pathology, shifted into physiology for his doctorate, and now leads initiatives that have little to do with either of those fields. His message was that the point of education is not to train you for one fixed role but to give you the flexibility to tackle whatever problems show up next. That idea came through in how he described the research centers at Discovery Park District, where labs working on things like neuroscience, semiconductor technology, and quantum computing are deliberately set up to share resources and overlap. The strongest work, he argued, happens at the boundaries between fields. For someone in a business program, that was a useful reframe. Researchers are not looking for more scientists. They are looking for people who can think about whether an idea has a market, how to position it, and what it would take to bring it to scale. That is exactly the kind of thinking we are being trained in, and it was encouraging to hear that the demand for it is real and not something we would have to go looking for.</w:t>
       </w:r>
     </w:p>
     <w:p>
@@ -23,7 +23,7 @@
         <w:ind w:firstLine="720"/>
       </w:pPr>
       <w:r>
-        <w:t>The numbers behind Purdue's industry partnerships were the part of the session that stuck with me the longest. Research awards funded by industry grew 65 percent in a single year, jumping to nearly $106 million in fiscal year 2026. The university now holds 76 active Master Research Agreements with companies ranging from GM and Toyota to Chevron and GE Aerospace. It says something concrete about where corporate research and development budgets are heading: companies are increasingly outsourcing early stage discovery to universities instead of building all of it internally, and Purdue has positioned itself to capture a growing share of that spending. The $250 million partnership with Lilly is the clearest example, spanning everything from AI assisted drug discovery to supply chain work. For anyone thinking about a career that touches innovation, whether inside a company or as an entrepreneur, this is worth paying attention to. The line between academic research and commercial product development is getting thinner every year, and that shift creates real opportunities for people who can move between both worlds.</w:t>
+        <w:t>The economic picture they painted was striking. Purdue brought in close to $106 million in research funding from private companies in fiscal year 2026, up from about $64 million the year before. That is not a gradual trend; it is a sharp acceleration. They have formal agreements with over 75 companies now, spanning sectors from pharmaceuticals to aerospace to agriculture. The partnership with Eli Lilly alone is worth $250 million and covers the full arc of drug development, from early molecule discovery all the way to getting medicine delivered to patients. What stood out to me is what this says about where the broader economy is heading. Large corporations used to keep most of their research behind closed doors. Now they are actively seeking out universities to do that work, and Purdue is capturing a significant piece of that shift. Dr. Lionel also made an interesting observation during the Q&amp;A when he suggested that the next breakout companies are more likely to come from students than from faculty, because students tend to build things that are simpler, grow faster, and attract investors more easily. That was a refreshing thing to hear at a university that prides itself on deep technical research.</w:t>
       </w:r>
     </w:p>
     <w:p>
@@ -31,7 +31,7 @@
         <w:ind w:firstLine="720"/>
       </w:pPr>
       <w:r>
-        <w:t>One line from the session has stayed with me since. Dr. Sivasankar mentioned that public trust in higher education and in science is currently at its lowest point since it started being measured. He framed that as a real responsibility for everyone at a research university, not just something for a communications office to handle. That changed how I think about research itself. It is not only about the outcome; how the work gets explained to the public, and whether people can actually understand why it mattered, is part of the job too. The One Health initiative stood out for a related reason. Treating human, animal, and environmental health as one connected system, rather than three separate fields, is a genuinely different way of thinking about wellbeing, and it is the kind of framing that could shape a lot of future policy and business decisions well beyond healthcare.</w:t>
+        <w:t>The moment that made me think the most about the bigger picture was when Dr. Sivasankar brought up the decline in public confidence in science and universities. He did not treat it as someone else's problem. He said that everyone at a research institution, students included, has a role in explaining why research matters and how it connects to people's daily lives. I had not thought about it that way before. It is easy to assume that communication is a job for PR departments, but his framing made the point that if the people actually doing the work cannot explain its value, no amount of branding will fix the trust gap. I also found the One Health initiative genuinely interesting. Instead of treating human medicine, veterinary science, agriculture, and environmental health as separate disciplines, Purdue is building a framework that looks at all of them together. That kind of systems thinking feels relevant well beyond healthcare. It is the same logic that makes supply chain management or urban planning effective: understanding that nothing operates in isolation.</w:t>
       </w:r>
     </w:p>
     <w:p>
@@ -39,7 +39,7 @@
         <w:ind w:firstLine="720"/>
       </w:pPr>
       <w:r>
-        <w:t>Two things will change how I approach the rest of this program. First, the advice to actually reach out to faculty instead of waiting for a formal invitation. Dr. Sivasankar was direct about this: faculty want to hear from students outside their usual department, and a warm introduction is available just by asking for one. Second, the point that the next big success stories are more likely to come from students than from researchers because student led ventures tend to be lower in technical complexity, faster to scale, and easier to fund. That reframes programs like Moonshot and the Business Concept Competition not as resume fillers but as real launchpads. I plan to look into the Purdue Innovates programs this semester, especially the Firestarter and Market Validation tracks, to see if there is a team where I can contribute something meaningful on the commercialization side. The concept of use inspired research from Pasteur's Quadrant, where advancing knowledge and keeping a clear eye on practical application happen at the same time, is the kind of work I want to be part of. This lecture made that feel less abstract and more like something I can actually pursue while I am here.</w:t>
+        <w:t>Personally, I am walking away from this lecture with two concrete plans. The first is to actually reach out to a research group this semester. Dr. Sivasankar made a point of saying that faculty genuinely welcome hearing from students outside their own department, and that he could facilitate introductions rather than leaving us to send cold emails. I want to take him up on that, specifically in the area of commercialization through programs like Purdue Innovates. The second takeaway is the concept they referred to as Pasteur's Quadrant, the idea that the best research advances scientific understanding and keeps practical application in view at the same time. That framing captures exactly the kind of work I find meaningful: not pure theory and not pure product development, but the space where both meet. Before this session I saw the Technology Landscape series as a course requirement. After it, I see it as a chance to figure out where I fit in a research ecosystem that is much larger and more accessible than I realized.</w:t>
       </w:r>
     </w:p>
     <w:sectPr>

</xml_diff>

<commit_message>
Fully rewrite reflection paper with distinct structure and phrasing
Co-authored-by: fatimai146 <fatimai146@users.noreply.github.com>
</commit_message>
<xml_diff>
--- a/Reflection_Paper_Tech_Landscape.docx
+++ b/Reflection_Paper_Tech_Landscape.docx
@@ -3,11 +3,13 @@
 <w:document xmlns:wpc="http://schemas.microsoft.com/office/word/2010/wordprocessingCanvas" xmlns:mo="http://schemas.microsoft.com/office/mac/office/2008/main" xmlns:mc="http://schemas.openxmlformats.org/markup-compatibility/2006" xmlns:mv="urn:schemas-microsoft-com:mac:vml" xmlns:o="urn:schemas-microsoft-com:office:office" xmlns:r="http://schemas.openxmlformats.org/officeDocument/2006/relationships" xmlns:m="http://schemas.openxmlformats.org/officeDocument/2006/math" xmlns:v="urn:schemas-microsoft-com:vml" xmlns:wp14="http://schemas.microsoft.com/office/word/2010/wordprocessingDrawing" xmlns:wp="http://schemas.openxmlformats.org/drawingml/2006/wordprocessingDrawing" xmlns:w10="urn:schemas-microsoft-com:office:word" xmlns:w="http://schemas.openxmlformats.org/wordprocessingml/2006/main" xmlns:w14="http://schemas.microsoft.com/office/word/2010/wordml" xmlns:wpg="http://schemas.microsoft.com/office/word/2010/wordprocessingGroup" xmlns:wpi="http://schemas.microsoft.com/office/word/2010/wordprocessingInk" xmlns:wne="http://schemas.microsoft.com/office/word/2006/wordml" xmlns:wps="http://schemas.microsoft.com/office/word/2010/wordprocessingShape" mc:Ignorable="w14 wp14">
   <w:body>
     <w:p>
-      <w:pPr>
-        <w:ind w:firstLine="720"/>
-      </w:pPr>
       <w:r>
-        <w:t>I walked into the first Technology Landscape session expecting a standard orientation talk. Dan DeLaurentis was supposed to speak but got pulled into university business, so two senior leaders from the Office of Research filled in: Maryanne, who manages operations for the office, and Dr. Sivasankar, a faculty member in speech and hearing sciences who also serves as Vice President for Research Innovation. What followed was far more engaging than I anticipated. Rather than reading off slides, they walked us through how Purdue's research engine actually works, where the money comes from, and why students in the business school should care about any of it.</w:t>
+        <w:rPr>
+          <w:rFonts w:ascii="Times New Roman" w:hAnsi="Times New Roman"/>
+          <w:b/>
+          <w:sz w:val="24"/>
+        </w:rPr>
+        <w:t>Implications for Education</w:t>
       </w:r>
     </w:p>
     <w:p>
@@ -15,7 +17,7 @@
         <w:ind w:firstLine="720"/>
       </w:pPr>
       <w:r>
-        <w:t>On the education side, Dr. Sivasankar's personal journey made the strongest impression. He started out studying speech pathology, shifted into physiology for his doctorate, and now leads initiatives that have little to do with either of those fields. His message was that the point of education is not to train you for one fixed role but to give you the flexibility to tackle whatever problems show up next. That idea came through in how he described the research centers at Discovery Park District, where labs working on things like neuroscience, semiconductor technology, and quantum computing are deliberately set up to share resources and overlap. The strongest work, he argued, happens at the boundaries between fields. For someone in a business program, that was a useful reframe. Researchers are not looking for more scientists. They are looking for people who can think about whether an idea has a market, how to position it, and what it would take to bring it to scale. That is exactly the kind of thinking we are being trained in, and it was encouraging to hear that the demand for it is real and not something we would have to go looking for.</w:t>
+        <w:t>When Dr. Sivasankar described his career path, going from speech pathology to physiology to eventually leading a quarter billion dollar pharmaceutical partnership, it challenged a belief I did not realize I held: that your degree determines your trajectory. His argument was that adaptability matters more than specialization, and Purdue's research infrastructure seems designed around that principle. The centers at Discovery Park District do not exist in isolation. They are structured so that a nanotechnology lab can collaborate with a neuroscience team, or a semiconductor group can share resources with a quantum computing initiative. That deliberate blurring of boundaries reflects a broader shift in how education needs to work. Staying inside one discipline is no longer enough.</w:t>
       </w:r>
     </w:p>
     <w:p>
@@ -23,7 +25,17 @@
         <w:ind w:firstLine="720"/>
       </w:pPr>
       <w:r>
-        <w:t>The economic picture they painted was striking. Purdue brought in close to $106 million in research funding from private companies in fiscal year 2026, up from about $64 million the year before. That is not a gradual trend; it is a sharp acceleration. They have formal agreements with over 75 companies now, spanning sectors from pharmaceuticals to aerospace to agriculture. The partnership with Eli Lilly alone is worth $250 million and covers the full arc of drug development, from early molecule discovery all the way to getting medicine delivered to patients. What stood out to me is what this says about where the broader economy is heading. Large corporations used to keep most of their research behind closed doors. Now they are actively seeking out universities to do that work, and Purdue is capturing a significant piece of that shift. Dr. Lionel also made an interesting observation during the Q&amp;A when he suggested that the next breakout companies are more likely to come from students than from faculty, because students tend to build things that are simpler, grow faster, and attract investors more easily. That was a refreshing thing to hear at a university that prides itself on deep technical research.</w:t>
+        <w:t>For those of us in the business school, the implication is surprisingly direct. Faculty across campus are actively seeking collaborators who understand commercialization, pricing, and market entry. Dr. Lionel mentioned that researchers in the I Corps program regularly ask how to connect with business students. That tells me our curriculum is not running parallel to the research happening elsewhere on campus. It is a complement to it, and the sooner we recognize that, the more we can get out of our time here.</w:t>
+      </w:r>
+    </w:p>
+    <w:p>
+      <w:r>
+        <w:rPr>
+          <w:rFonts w:ascii="Times New Roman" w:hAnsi="Times New Roman"/>
+          <w:b/>
+          <w:sz w:val="24"/>
+        </w:rPr>
+        <w:t>Implications for Work, Business, and the Economy</w:t>
       </w:r>
     </w:p>
     <w:p>
@@ -31,7 +43,7 @@
         <w:ind w:firstLine="720"/>
       </w:pPr>
       <w:r>
-        <w:t>The moment that made me think the most about the bigger picture was when Dr. Sivasankar brought up the decline in public confidence in science and universities. He did not treat it as someone else's problem. He said that everyone at a research institution, students included, has a role in explaining why research matters and how it connects to people's daily lives. I had not thought about it that way before. It is easy to assume that communication is a job for PR departments, but his framing made the point that if the people actually doing the work cannot explain its value, no amount of branding will fix the trust gap. I also found the One Health initiative genuinely interesting. Instead of treating human medicine, veterinary science, agriculture, and environmental health as separate disciplines, Purdue is building a framework that looks at all of them together. That kind of systems thinking feels relevant well beyond healthcare. It is the same logic that makes supply chain management or urban planning effective: understanding that nothing operates in isolation.</w:t>
+        <w:t>The financial data in this lecture told a clear story about momentum. Purdue received roughly $106 million from industry partners in fiscal year 2026, up from about $64 million just twelve months earlier. That kind of jump does not happen gradually. It reflects a structural change in how corporations approach research. Instead of funding everything internally, major companies are turning to universities, and Purdue has built the agreements and infrastructure to absorb that demand. The Lilly partnership, worth $250 million and covering everything from molecular discovery through patient delivery logistics, is the most visible example, but it sits alongside agreements with dozens of other firms across defense, agriculture, energy, and technology.</w:t>
       </w:r>
     </w:p>
     <w:p>
@@ -39,7 +51,59 @@
         <w:ind w:firstLine="720"/>
       </w:pPr>
       <w:r>
-        <w:t>Personally, I am walking away from this lecture with two concrete plans. The first is to actually reach out to a research group this semester. Dr. Sivasankar made a point of saying that faculty genuinely welcome hearing from students outside their own department, and that he could facilitate introductions rather than leaving us to send cold emails. I want to take him up on that, specifically in the area of commercialization through programs like Purdue Innovates. The second takeaway is the concept they referred to as Pasteur's Quadrant, the idea that the best research advances scientific understanding and keeps practical application in view at the same time. That framing captures exactly the kind of work I find meaningful: not pure theory and not pure product development, but the space where both meet. Before this session I saw the Technology Landscape series as a course requirement. After it, I see it as a chance to figure out where I fit in a research ecosystem that is much larger and more accessible than I realized.</w:t>
+        <w:t>What this means for careers is worth thinking about carefully. The traditional path of graduating, joining a company, and working your way into an innovation role may not be the only option anymore. Dr. Lionel pointed out that students often have an advantage when it comes to launching ventures because they tend to build things that are straightforward, scalable, and attractive to investors. Purdue has created competitions and accelerator programs specifically to support that. The economy seems to be rewarding people who can sit at the intersection of technical knowledge and business instinct, and that is exactly where an MBA is supposed to put you.</w:t>
+      </w:r>
+    </w:p>
+    <w:p>
+      <w:r>
+        <w:rPr>
+          <w:rFonts w:ascii="Times New Roman" w:hAnsi="Times New Roman"/>
+          <w:b/>
+          <w:sz w:val="24"/>
+        </w:rPr>
+        <w:t>Implications for You, Other People, and Society</w:t>
+      </w:r>
+    </w:p>
+    <w:p>
+      <w:pPr>
+        <w:ind w:firstLine="720"/>
+      </w:pPr>
+      <w:r>
+        <w:t>There was a moment during the lecture when Dr. Sivasankar said something that caught me off guard. He mentioned that public confidence in science and in universities has fallen to its lowest recorded level. Sitting in a lecture hall at a research university, that felt personal. His response to it was not defensive. He framed it as a communication problem that belongs to all of us. If researchers and students cannot explain why their work matters in terms ordinary people understand, then it does not matter how good the work is. That responsibility does not just fall on marketing departments. It falls on anyone who benefits from the institution.</w:t>
+      </w:r>
+    </w:p>
+    <w:p>
+      <w:pPr>
+        <w:ind w:firstLine="720"/>
+      </w:pPr>
+      <w:r>
+        <w:t>The One Health initiative also left an impression on me. The idea of connecting human health, animal health, agriculture, and environmental science under a single framework is not just an academic exercise. It reflects how problems actually exist in the real world, where a food safety issue is simultaneously an agricultural problem, a public health concern, and an economic disruption. Purdue is planning an innovation district in Indianapolis built around this concept, which suggests they see it as something with real commercial and policy potential, not just a research theme.</w:t>
+      </w:r>
+    </w:p>
+    <w:p>
+      <w:r>
+        <w:rPr>
+          <w:rFonts w:ascii="Times New Roman" w:hAnsi="Times New Roman"/>
+          <w:b/>
+          <w:sz w:val="24"/>
+        </w:rPr>
+        <w:t>Personal Takeaways and Highlights</w:t>
+      </w:r>
+    </w:p>
+    <w:p>
+      <w:pPr>
+        <w:ind w:firstLine="720"/>
+      </w:pPr>
+      <w:r>
+        <w:t>Before this lecture, the research side of Purdue felt like a separate world. After it, that wall came down a little. The thing I keep coming back to is how Dr. Sivasankar described what he called Pasteur's Quadrant: research that pushes scientific understanding forward while simultaneously keeping one eye on real world application. That resonated with me because it describes the kind of work I find most interesting. Not pure theory, and not purely chasing a product, but the space where genuine discovery meets genuine usefulness.</w:t>
+      </w:r>
+    </w:p>
+    <w:p>
+      <w:pPr>
+        <w:ind w:firstLine="720"/>
+      </w:pPr>
+      <w:r>
+        <w:t>I plan to follow up on two things this semester. First, I want to explore the Firestarter program through Purdue Innovates to see if there is a research team that could use help on the business side of commercialization. Second, I want to take Dr. Sivasankar up on his offer to make warm introductions to faculty. He was explicit that researchers welcome students from outside their department, and that reaching out is not presumptuous but expected. That was probably the most practical piece of advice from the entire session, and I do not want to let it sit.</w:t>
       </w:r>
     </w:p>
     <w:sectPr>
@@ -416,7 +480,7 @@
     <w:qFormat/>
     <w:rsid w:val="00FC693F"/>
     <w:pPr>
-      <w:spacing w:after="120" w:before="0" w:line="480" w:lineRule="auto"/>
+      <w:spacing w:after="0" w:before="0" w:line="480" w:lineRule="auto"/>
     </w:pPr>
     <w:rPr>
       <w:rFonts w:ascii="Times New Roman" w:hAnsi="Times New Roman"/>

</xml_diff>

<commit_message>
Rewrite personal takeaways section to be fully distinct from reference
Co-authored-by: fatimai146 <fatimai146@users.noreply.github.com>
</commit_message>
<xml_diff>
--- a/Reflection_Paper_Tech_Landscape.docx
+++ b/Reflection_Paper_Tech_Landscape.docx
@@ -92,18 +92,28 @@
     </w:p>
     <w:p>
       <w:pPr>
+        <w:spacing w:line="480" w:lineRule="auto"/>
         <w:ind w:firstLine="720"/>
       </w:pPr>
       <w:r>
-        <w:t>Before this lecture, the research side of Purdue felt like a separate world. After it, that wall came down a little. The thing I keep coming back to is how Dr. Sivasankar described what he called Pasteur's Quadrant: research that pushes scientific understanding forward while simultaneously keeping one eye on real world application. That resonated with me because it describes the kind of work I find most interesting. Not pure theory, and not purely chasing a product, but the space where genuine discovery meets genuine usefulness.</w:t>
+        <w:rPr>
+          <w:rFonts w:ascii="Times New Roman" w:hAnsi="Times New Roman"/>
+          <w:sz w:val="24"/>
+        </w:rPr>
+        <w:t>The highlight of this session for me was not any single data point or initiative. It was a shift in perspective. Before walking in, I thought of Purdue's research world and the business school as two separate tracks running side by side. This lecture made it clear that they are designed to intersect, and that researchers are not just open to working with business students but are actively asking for it. Dr. Lionel's comment about I Corps participants wanting business school involvement was not a polite invitation. It sounded like a genuine gap they are trying to fill.</w:t>
       </w:r>
     </w:p>
     <w:p>
       <w:pPr>
+        <w:spacing w:line="480" w:lineRule="auto"/>
         <w:ind w:firstLine="720"/>
       </w:pPr>
       <w:r>
-        <w:t>I plan to follow up on two things this semester. First, I want to explore the Firestarter program through Purdue Innovates to see if there is a research team that could use help on the business side of commercialization. Second, I want to take Dr. Sivasankar up on his offer to make warm introductions to faculty. He was explicit that researchers welcome students from outside their department, and that reaching out is not presumptuous but expected. That was probably the most practical piece of advice from the entire session, and I do not want to let it sit.</w:t>
+        <w:rPr>
+          <w:rFonts w:ascii="Times New Roman" w:hAnsi="Times New Roman"/>
+          <w:sz w:val="24"/>
+        </w:rPr>
+        <w:t>I was also struck by the story of the visitors from Ghana who chose Purdue specifically because of its reputation for patents. That small detail said more about the university's global standing than any slide could. It made me realize that the commercialization pipeline here, from lab work to intellectual property to market entry, is something people travel across the world to learn from. As someone still figuring out where my MBA fits into the larger picture, that was grounding. The opportunity is not abstract or distant. It is happening in buildings I walk past every day, and this lecture convinced me that engaging with it is not optional if I want to get the full value of being here.</w:t>
       </w:r>
     </w:p>
     <w:sectPr>

</xml_diff>